<commit_message>
Add ETL process and database integration
</commit_message>
<xml_diff>
--- a/note.docx
+++ b/note.docx
@@ -12,7 +12,6 @@
           <w:lang w:eastAsia="de-DE"/>
         </w:rPr>
       </w:pPr>
-      <w:bookmarkStart w:id="0" w:name="_GoBack"/>
       <w:r>
         <w:rPr>
           <w:rFonts w:eastAsia="Times New Roman" w:cstheme="minorHAnsi"/>
@@ -334,7 +333,1409 @@
         <w:t>Mein Fokus liegt auf der Analyse von Kundenportfolios und dem Vergleich der Performance verschiedener Kunden.</w:t>
       </w:r>
     </w:p>
+    <w:p>
+      <w:pPr>
+        <w:spacing w:before="100" w:beforeAutospacing="1" w:after="100" w:afterAutospacing="1" w:line="240" w:lineRule="auto"/>
+        <w:rPr>
+          <w:rFonts w:eastAsia="Times New Roman" w:cstheme="minorHAnsi"/>
+          <w:sz w:val="24"/>
+          <w:szCs w:val="24"/>
+          <w:lang w:eastAsia="de-DE"/>
+        </w:rPr>
+      </w:pPr>
+    </w:p>
+    <w:p>
+      <w:pPr>
+        <w:spacing w:before="100" w:beforeAutospacing="1" w:after="100" w:afterAutospacing="1" w:line="240" w:lineRule="auto"/>
+        <w:rPr>
+          <w:rFonts w:eastAsia="Times New Roman" w:cstheme="minorHAnsi"/>
+          <w:sz w:val="24"/>
+          <w:szCs w:val="24"/>
+          <w:lang w:eastAsia="de-DE"/>
+        </w:rPr>
+      </w:pPr>
+    </w:p>
+    <w:p>
+      <w:pPr>
+        <w:spacing w:before="100" w:beforeAutospacing="1" w:after="100" w:afterAutospacing="1" w:line="240" w:lineRule="auto"/>
+      </w:pPr>
+      <w:r>
+        <w:t>Ich habe ein ETL-Projekt mit Python gemacht, mit API und CSV-Daten. Ich analysiere den Profit von Kunden.</w:t>
+      </w:r>
+    </w:p>
+    <w:p>
+      <w:r>
+        <w:br w:type="page"/>
+      </w:r>
+    </w:p>
+    <w:p>
+      <w:pPr>
+        <w:spacing w:before="100" w:beforeAutospacing="1" w:after="100" w:afterAutospacing="1" w:line="240" w:lineRule="auto"/>
+        <w:rPr>
+          <w:lang w:val="uk-UA"/>
+        </w:rPr>
+      </w:pPr>
+      <w:r>
+        <w:lastRenderedPageBreak/>
+        <w:t>Pandas und OOP sind zwei verschiedene Ansätze. OOP arbeitet mit Objekten, Pandas mit Tabellen. Für Datenanalyse ist Pandas besser geeignet.</w:t>
+      </w:r>
+    </w:p>
+    <w:tbl>
+      <w:tblPr>
+        <w:tblW w:w="3563" w:type="dxa"/>
+        <w:tblCellSpacing w:w="15" w:type="dxa"/>
+        <w:tblBorders>
+          <w:top w:val="single" w:sz="4" w:space="0" w:color="auto"/>
+          <w:left w:val="single" w:sz="4" w:space="0" w:color="auto"/>
+          <w:bottom w:val="single" w:sz="4" w:space="0" w:color="auto"/>
+          <w:right w:val="single" w:sz="4" w:space="0" w:color="auto"/>
+          <w:insideH w:val="single" w:sz="4" w:space="0" w:color="auto"/>
+          <w:insideV w:val="single" w:sz="4" w:space="0" w:color="auto"/>
+        </w:tblBorders>
+        <w:tblCellMar>
+          <w:top w:w="15" w:type="dxa"/>
+          <w:left w:w="15" w:type="dxa"/>
+          <w:bottom w:w="15" w:type="dxa"/>
+          <w:right w:w="15" w:type="dxa"/>
+        </w:tblCellMar>
+        <w:tblLook w:val="04A0" w:firstRow="1" w:lastRow="0" w:firstColumn="1" w:lastColumn="0" w:noHBand="0" w:noVBand="1"/>
+      </w:tblPr>
+      <w:tblGrid>
+        <w:gridCol w:w="1450"/>
+        <w:gridCol w:w="2113"/>
+      </w:tblGrid>
+      <w:tr>
+        <w:trPr>
+          <w:trHeight w:val="234"/>
+          <w:tblHeader/>
+          <w:tblCellSpacing w:w="15" w:type="dxa"/>
+        </w:trPr>
+        <w:tc>
+          <w:tcPr>
+            <w:tcW w:w="0" w:type="auto"/>
+            <w:vAlign w:val="center"/>
+            <w:hideMark/>
+          </w:tcPr>
+          <w:p>
+            <w:pPr>
+              <w:spacing w:after="0" w:line="240" w:lineRule="auto"/>
+              <w:jc w:val="center"/>
+              <w:rPr>
+                <w:rFonts w:ascii="Times New Roman" w:eastAsia="Times New Roman" w:hAnsi="Times New Roman" w:cs="Times New Roman"/>
+                <w:b/>
+                <w:bCs/>
+                <w:sz w:val="24"/>
+                <w:szCs w:val="24"/>
+                <w:lang w:eastAsia="de-DE"/>
+              </w:rPr>
+            </w:pPr>
+            <w:r>
+              <w:rPr>
+                <w:rFonts w:ascii="Times New Roman" w:eastAsia="Times New Roman" w:hAnsi="Times New Roman" w:cs="Times New Roman"/>
+                <w:b/>
+                <w:bCs/>
+                <w:sz w:val="24"/>
+                <w:szCs w:val="24"/>
+                <w:lang w:eastAsia="de-DE"/>
+              </w:rPr>
+              <w:t>OOP</w:t>
+            </w:r>
+          </w:p>
+        </w:tc>
+        <w:tc>
+          <w:tcPr>
+            <w:tcW w:w="0" w:type="auto"/>
+            <w:vAlign w:val="center"/>
+            <w:hideMark/>
+          </w:tcPr>
+          <w:p>
+            <w:pPr>
+              <w:spacing w:after="0" w:line="240" w:lineRule="auto"/>
+              <w:jc w:val="center"/>
+              <w:rPr>
+                <w:rFonts w:ascii="Times New Roman" w:eastAsia="Times New Roman" w:hAnsi="Times New Roman" w:cs="Times New Roman"/>
+                <w:b/>
+                <w:bCs/>
+                <w:sz w:val="24"/>
+                <w:szCs w:val="24"/>
+                <w:lang w:eastAsia="de-DE"/>
+              </w:rPr>
+            </w:pPr>
+            <w:r>
+              <w:rPr>
+                <w:rFonts w:ascii="Times New Roman" w:eastAsia="Times New Roman" w:hAnsi="Times New Roman" w:cs="Times New Roman"/>
+                <w:b/>
+                <w:bCs/>
+                <w:sz w:val="24"/>
+                <w:szCs w:val="24"/>
+                <w:lang w:eastAsia="de-DE"/>
+              </w:rPr>
+              <w:t>Pandas</w:t>
+            </w:r>
+          </w:p>
+        </w:tc>
+      </w:tr>
+      <w:tr>
+        <w:trPr>
+          <w:trHeight w:val="244"/>
+          <w:tblCellSpacing w:w="15" w:type="dxa"/>
+        </w:trPr>
+        <w:tc>
+          <w:tcPr>
+            <w:tcW w:w="0" w:type="auto"/>
+            <w:vAlign w:val="center"/>
+            <w:hideMark/>
+          </w:tcPr>
+          <w:p>
+            <w:pPr>
+              <w:spacing w:after="0" w:line="240" w:lineRule="auto"/>
+              <w:rPr>
+                <w:rFonts w:ascii="Times New Roman" w:eastAsia="Times New Roman" w:hAnsi="Times New Roman" w:cs="Times New Roman"/>
+                <w:sz w:val="24"/>
+                <w:szCs w:val="24"/>
+                <w:lang w:eastAsia="de-DE"/>
+              </w:rPr>
+            </w:pPr>
+            <w:proofErr w:type="spellStart"/>
+            <w:r>
+              <w:rPr>
+                <w:rFonts w:ascii="Times New Roman" w:eastAsia="Times New Roman" w:hAnsi="Times New Roman" w:cs="Times New Roman"/>
+                <w:sz w:val="24"/>
+                <w:szCs w:val="24"/>
+                <w:lang w:eastAsia="de-DE"/>
+              </w:rPr>
+              <w:t>об’єкти</w:t>
+            </w:r>
+            <w:proofErr w:type="spellEnd"/>
+          </w:p>
+        </w:tc>
+        <w:tc>
+          <w:tcPr>
+            <w:tcW w:w="0" w:type="auto"/>
+            <w:vAlign w:val="center"/>
+            <w:hideMark/>
+          </w:tcPr>
+          <w:p>
+            <w:pPr>
+              <w:spacing w:after="0" w:line="240" w:lineRule="auto"/>
+              <w:rPr>
+                <w:rFonts w:ascii="Times New Roman" w:eastAsia="Times New Roman" w:hAnsi="Times New Roman" w:cs="Times New Roman"/>
+                <w:sz w:val="24"/>
+                <w:szCs w:val="24"/>
+                <w:lang w:eastAsia="de-DE"/>
+              </w:rPr>
+            </w:pPr>
+            <w:proofErr w:type="spellStart"/>
+            <w:r>
+              <w:rPr>
+                <w:rFonts w:ascii="Times New Roman" w:eastAsia="Times New Roman" w:hAnsi="Times New Roman" w:cs="Times New Roman"/>
+                <w:sz w:val="24"/>
+                <w:szCs w:val="24"/>
+                <w:lang w:eastAsia="de-DE"/>
+              </w:rPr>
+              <w:t>таблиці</w:t>
+            </w:r>
+            <w:proofErr w:type="spellEnd"/>
+          </w:p>
+        </w:tc>
+      </w:tr>
+      <w:tr>
+        <w:trPr>
+          <w:trHeight w:val="244"/>
+          <w:tblCellSpacing w:w="15" w:type="dxa"/>
+        </w:trPr>
+        <w:tc>
+          <w:tcPr>
+            <w:tcW w:w="0" w:type="auto"/>
+            <w:vAlign w:val="center"/>
+            <w:hideMark/>
+          </w:tcPr>
+          <w:p>
+            <w:pPr>
+              <w:spacing w:after="0" w:line="240" w:lineRule="auto"/>
+              <w:rPr>
+                <w:rFonts w:ascii="Times New Roman" w:eastAsia="Times New Roman" w:hAnsi="Times New Roman" w:cs="Times New Roman"/>
+                <w:sz w:val="24"/>
+                <w:szCs w:val="24"/>
+                <w:lang w:eastAsia="de-DE"/>
+              </w:rPr>
+            </w:pPr>
+            <w:proofErr w:type="spellStart"/>
+            <w:r>
+              <w:rPr>
+                <w:rFonts w:ascii="Times New Roman" w:eastAsia="Times New Roman" w:hAnsi="Times New Roman" w:cs="Times New Roman"/>
+                <w:sz w:val="24"/>
+                <w:szCs w:val="24"/>
+                <w:lang w:eastAsia="de-DE"/>
+              </w:rPr>
+              <w:t>класи</w:t>
+            </w:r>
+            <w:proofErr w:type="spellEnd"/>
+          </w:p>
+        </w:tc>
+        <w:tc>
+          <w:tcPr>
+            <w:tcW w:w="0" w:type="auto"/>
+            <w:vAlign w:val="center"/>
+            <w:hideMark/>
+          </w:tcPr>
+          <w:p>
+            <w:pPr>
+              <w:spacing w:after="0" w:line="240" w:lineRule="auto"/>
+              <w:rPr>
+                <w:rFonts w:ascii="Times New Roman" w:eastAsia="Times New Roman" w:hAnsi="Times New Roman" w:cs="Times New Roman"/>
+                <w:sz w:val="24"/>
+                <w:szCs w:val="24"/>
+                <w:lang w:eastAsia="de-DE"/>
+              </w:rPr>
+            </w:pPr>
+            <w:proofErr w:type="spellStart"/>
+            <w:r>
+              <w:rPr>
+                <w:rFonts w:ascii="Times New Roman" w:eastAsia="Times New Roman" w:hAnsi="Times New Roman" w:cs="Times New Roman"/>
+                <w:sz w:val="24"/>
+                <w:szCs w:val="24"/>
+                <w:lang w:eastAsia="de-DE"/>
+              </w:rPr>
+              <w:t>DataFrame</w:t>
+            </w:r>
+            <w:proofErr w:type="spellEnd"/>
+          </w:p>
+        </w:tc>
+      </w:tr>
+      <w:tr>
+        <w:trPr>
+          <w:trHeight w:val="234"/>
+          <w:tblCellSpacing w:w="15" w:type="dxa"/>
+        </w:trPr>
+        <w:tc>
+          <w:tcPr>
+            <w:tcW w:w="0" w:type="auto"/>
+            <w:vAlign w:val="center"/>
+            <w:hideMark/>
+          </w:tcPr>
+          <w:p>
+            <w:pPr>
+              <w:spacing w:after="0" w:line="240" w:lineRule="auto"/>
+              <w:rPr>
+                <w:rFonts w:ascii="Times New Roman" w:eastAsia="Times New Roman" w:hAnsi="Times New Roman" w:cs="Times New Roman"/>
+                <w:sz w:val="24"/>
+                <w:szCs w:val="24"/>
+                <w:lang w:eastAsia="de-DE"/>
+              </w:rPr>
+            </w:pPr>
+            <w:proofErr w:type="spellStart"/>
+            <w:r>
+              <w:rPr>
+                <w:rFonts w:ascii="Times New Roman" w:eastAsia="Times New Roman" w:hAnsi="Times New Roman" w:cs="Times New Roman"/>
+                <w:sz w:val="24"/>
+                <w:szCs w:val="24"/>
+                <w:lang w:eastAsia="de-DE"/>
+              </w:rPr>
+              <w:t>логіка</w:t>
+            </w:r>
+            <w:proofErr w:type="spellEnd"/>
+          </w:p>
+        </w:tc>
+        <w:tc>
+          <w:tcPr>
+            <w:tcW w:w="0" w:type="auto"/>
+            <w:vAlign w:val="center"/>
+            <w:hideMark/>
+          </w:tcPr>
+          <w:p>
+            <w:pPr>
+              <w:spacing w:after="0" w:line="240" w:lineRule="auto"/>
+              <w:rPr>
+                <w:rFonts w:ascii="Times New Roman" w:eastAsia="Times New Roman" w:hAnsi="Times New Roman" w:cs="Times New Roman"/>
+                <w:sz w:val="24"/>
+                <w:szCs w:val="24"/>
+                <w:lang w:eastAsia="de-DE"/>
+              </w:rPr>
+            </w:pPr>
+            <w:proofErr w:type="spellStart"/>
+            <w:r>
+              <w:rPr>
+                <w:rFonts w:ascii="Times New Roman" w:eastAsia="Times New Roman" w:hAnsi="Times New Roman" w:cs="Times New Roman"/>
+                <w:sz w:val="24"/>
+                <w:szCs w:val="24"/>
+                <w:lang w:eastAsia="de-DE"/>
+              </w:rPr>
+              <w:t>аналіз</w:t>
+            </w:r>
+            <w:proofErr w:type="spellEnd"/>
+          </w:p>
+        </w:tc>
+      </w:tr>
+      <w:tr>
+        <w:trPr>
+          <w:trHeight w:val="234"/>
+          <w:tblCellSpacing w:w="15" w:type="dxa"/>
+        </w:trPr>
+        <w:tc>
+          <w:tcPr>
+            <w:tcW w:w="0" w:type="auto"/>
+            <w:vAlign w:val="center"/>
+            <w:hideMark/>
+          </w:tcPr>
+          <w:p>
+            <w:pPr>
+              <w:spacing w:after="0" w:line="240" w:lineRule="auto"/>
+              <w:rPr>
+                <w:rFonts w:ascii="Times New Roman" w:eastAsia="Times New Roman" w:hAnsi="Times New Roman" w:cs="Times New Roman"/>
+                <w:sz w:val="24"/>
+                <w:szCs w:val="24"/>
+                <w:lang w:eastAsia="de-DE"/>
+              </w:rPr>
+            </w:pPr>
+            <w:r>
+              <w:rPr>
+                <w:rFonts w:ascii="Times New Roman" w:eastAsia="Times New Roman" w:hAnsi="Times New Roman" w:cs="Times New Roman"/>
+                <w:sz w:val="24"/>
+                <w:szCs w:val="24"/>
+                <w:lang w:eastAsia="de-DE"/>
+              </w:rPr>
+              <w:t>Backend</w:t>
+            </w:r>
+          </w:p>
+        </w:tc>
+        <w:tc>
+          <w:tcPr>
+            <w:tcW w:w="0" w:type="auto"/>
+            <w:vAlign w:val="center"/>
+            <w:hideMark/>
+          </w:tcPr>
+          <w:p>
+            <w:pPr>
+              <w:spacing w:after="0" w:line="240" w:lineRule="auto"/>
+              <w:rPr>
+                <w:rFonts w:ascii="Times New Roman" w:eastAsia="Times New Roman" w:hAnsi="Times New Roman" w:cs="Times New Roman"/>
+                <w:sz w:val="24"/>
+                <w:szCs w:val="24"/>
+                <w:lang w:eastAsia="de-DE"/>
+              </w:rPr>
+            </w:pPr>
+            <w:r>
+              <w:rPr>
+                <w:rFonts w:ascii="Times New Roman" w:eastAsia="Times New Roman" w:hAnsi="Times New Roman" w:cs="Times New Roman"/>
+                <w:sz w:val="24"/>
+                <w:szCs w:val="24"/>
+                <w:lang w:eastAsia="de-DE"/>
+              </w:rPr>
+              <w:t>Data Analyst</w:t>
+            </w:r>
+          </w:p>
+        </w:tc>
+      </w:tr>
+    </w:tbl>
+    <w:p>
+      <w:pPr>
+        <w:spacing w:before="100" w:beforeAutospacing="1" w:after="100" w:afterAutospacing="1" w:line="240" w:lineRule="auto"/>
+        <w:rPr>
+          <w:rFonts w:eastAsia="Times New Roman" w:cstheme="minorHAnsi"/>
+          <w:sz w:val="24"/>
+          <w:szCs w:val="24"/>
+          <w:lang w:eastAsia="de-DE"/>
+        </w:rPr>
+      </w:pPr>
+    </w:p>
+    <w:p>
+      <w:pPr>
+        <w:spacing w:before="100" w:beforeAutospacing="1" w:after="100" w:afterAutospacing="1" w:line="240" w:lineRule="auto"/>
+        <w:outlineLvl w:val="1"/>
+        <w:rPr>
+          <w:rFonts w:ascii="Times New Roman" w:eastAsia="Times New Roman" w:hAnsi="Times New Roman" w:cs="Times New Roman"/>
+          <w:b/>
+          <w:bCs/>
+          <w:sz w:val="36"/>
+          <w:szCs w:val="36"/>
+          <w:lang w:eastAsia="de-DE"/>
+        </w:rPr>
+      </w:pPr>
+      <w:r>
+        <w:rPr>
+          <w:rFonts w:ascii="Segoe UI Emoji" w:eastAsia="Times New Roman" w:hAnsi="Segoe UI Emoji" w:cs="Segoe UI Emoji"/>
+          <w:b/>
+          <w:bCs/>
+          <w:sz w:val="36"/>
+          <w:szCs w:val="36"/>
+          <w:lang w:eastAsia="de-DE"/>
+        </w:rPr>
+        <w:t>🔹</w:t>
+      </w:r>
+      <w:r>
+        <w:rPr>
+          <w:rFonts w:ascii="Times New Roman" w:eastAsia="Times New Roman" w:hAnsi="Times New Roman" w:cs="Times New Roman"/>
+          <w:b/>
+          <w:bCs/>
+          <w:sz w:val="36"/>
+          <w:szCs w:val="36"/>
+          <w:lang w:eastAsia="de-DE"/>
+        </w:rPr>
+        <w:t xml:space="preserve"> </w:t>
+      </w:r>
+      <w:proofErr w:type="spellStart"/>
+      <w:r>
+        <w:rPr>
+          <w:rFonts w:ascii="Times New Roman" w:eastAsia="Times New Roman" w:hAnsi="Times New Roman" w:cs="Times New Roman"/>
+          <w:b/>
+          <w:bCs/>
+          <w:sz w:val="36"/>
+          <w:szCs w:val="36"/>
+          <w:lang w:eastAsia="de-DE"/>
+        </w:rPr>
+        <w:t>assets</w:t>
+      </w:r>
+      <w:proofErr w:type="spellEnd"/>
+      <w:r>
+        <w:rPr>
+          <w:rFonts w:ascii="Times New Roman" w:eastAsia="Times New Roman" w:hAnsi="Times New Roman" w:cs="Times New Roman"/>
+          <w:b/>
+          <w:bCs/>
+          <w:sz w:val="36"/>
+          <w:szCs w:val="36"/>
+          <w:lang w:eastAsia="de-DE"/>
+        </w:rPr>
+        <w:t xml:space="preserve"> = </w:t>
+      </w:r>
+      <w:proofErr w:type="spellStart"/>
+      <w:r>
+        <w:rPr>
+          <w:rFonts w:ascii="Times New Roman" w:eastAsia="Times New Roman" w:hAnsi="Times New Roman" w:cs="Times New Roman"/>
+          <w:b/>
+          <w:bCs/>
+          <w:sz w:val="36"/>
+          <w:szCs w:val="36"/>
+          <w:lang w:eastAsia="de-DE"/>
+        </w:rPr>
+        <w:t>конкретні</w:t>
+      </w:r>
+      <w:proofErr w:type="spellEnd"/>
+      <w:r>
+        <w:rPr>
+          <w:rFonts w:ascii="Times New Roman" w:eastAsia="Times New Roman" w:hAnsi="Times New Roman" w:cs="Times New Roman"/>
+          <w:b/>
+          <w:bCs/>
+          <w:sz w:val="36"/>
+          <w:szCs w:val="36"/>
+          <w:lang w:eastAsia="de-DE"/>
+        </w:rPr>
+        <w:t xml:space="preserve"> </w:t>
+      </w:r>
+      <w:proofErr w:type="spellStart"/>
+      <w:r>
+        <w:rPr>
+          <w:rFonts w:ascii="Times New Roman" w:eastAsia="Times New Roman" w:hAnsi="Times New Roman" w:cs="Times New Roman"/>
+          <w:b/>
+          <w:bCs/>
+          <w:sz w:val="36"/>
+          <w:szCs w:val="36"/>
+          <w:lang w:eastAsia="de-DE"/>
+        </w:rPr>
+        <w:t>речі</w:t>
+      </w:r>
+      <w:proofErr w:type="spellEnd"/>
+    </w:p>
+    <w:p>
+      <w:pPr>
+        <w:spacing w:before="100" w:beforeAutospacing="1" w:after="100" w:afterAutospacing="1" w:line="240" w:lineRule="auto"/>
+        <w:rPr>
+          <w:rFonts w:ascii="Times New Roman" w:eastAsia="Times New Roman" w:hAnsi="Times New Roman" w:cs="Times New Roman"/>
+          <w:sz w:val="24"/>
+          <w:szCs w:val="24"/>
+          <w:lang w:eastAsia="de-DE"/>
+        </w:rPr>
+      </w:pPr>
+      <w:r>
+        <w:rPr>
+          <w:rFonts w:ascii="Segoe UI Emoji" w:eastAsia="Times New Roman" w:hAnsi="Segoe UI Emoji" w:cs="Segoe UI Emoji"/>
+          <w:sz w:val="24"/>
+          <w:szCs w:val="24"/>
+          <w:lang w:eastAsia="de-DE"/>
+        </w:rPr>
+        <w:t>👉</w:t>
+      </w:r>
+      <w:r>
+        <w:rPr>
+          <w:rFonts w:ascii="Times New Roman" w:eastAsia="Times New Roman" w:hAnsi="Times New Roman" w:cs="Times New Roman"/>
+          <w:sz w:val="24"/>
+          <w:szCs w:val="24"/>
+          <w:lang w:eastAsia="de-DE"/>
+        </w:rPr>
+        <w:t xml:space="preserve"> </w:t>
+      </w:r>
+      <w:proofErr w:type="spellStart"/>
+      <w:r>
+        <w:rPr>
+          <w:rFonts w:ascii="Times New Roman" w:eastAsia="Times New Roman" w:hAnsi="Times New Roman" w:cs="Times New Roman"/>
+          <w:sz w:val="24"/>
+          <w:szCs w:val="24"/>
+          <w:lang w:eastAsia="de-DE"/>
+        </w:rPr>
+        <w:t>що</w:t>
+      </w:r>
+      <w:proofErr w:type="spellEnd"/>
+      <w:r>
+        <w:rPr>
+          <w:rFonts w:ascii="Times New Roman" w:eastAsia="Times New Roman" w:hAnsi="Times New Roman" w:cs="Times New Roman"/>
+          <w:sz w:val="24"/>
+          <w:szCs w:val="24"/>
+          <w:lang w:eastAsia="de-DE"/>
+        </w:rPr>
+        <w:t xml:space="preserve"> </w:t>
+      </w:r>
+      <w:proofErr w:type="spellStart"/>
+      <w:r>
+        <w:rPr>
+          <w:rFonts w:ascii="Times New Roman" w:eastAsia="Times New Roman" w:hAnsi="Times New Roman" w:cs="Times New Roman"/>
+          <w:sz w:val="24"/>
+          <w:szCs w:val="24"/>
+          <w:lang w:eastAsia="de-DE"/>
+        </w:rPr>
+        <w:t>саме</w:t>
+      </w:r>
+      <w:proofErr w:type="spellEnd"/>
+      <w:r>
+        <w:rPr>
+          <w:rFonts w:ascii="Times New Roman" w:eastAsia="Times New Roman" w:hAnsi="Times New Roman" w:cs="Times New Roman"/>
+          <w:sz w:val="24"/>
+          <w:szCs w:val="24"/>
+          <w:lang w:eastAsia="de-DE"/>
+        </w:rPr>
+        <w:t xml:space="preserve"> </w:t>
+      </w:r>
+      <w:proofErr w:type="spellStart"/>
+      <w:r>
+        <w:rPr>
+          <w:rFonts w:ascii="Times New Roman" w:eastAsia="Times New Roman" w:hAnsi="Times New Roman" w:cs="Times New Roman"/>
+          <w:sz w:val="24"/>
+          <w:szCs w:val="24"/>
+          <w:lang w:eastAsia="de-DE"/>
+        </w:rPr>
+        <w:t>купили</w:t>
+      </w:r>
+      <w:proofErr w:type="spellEnd"/>
+    </w:p>
+    <w:p>
+      <w:pPr>
+        <w:tabs>
+          <w:tab w:val="left" w:pos="916"/>
+          <w:tab w:val="left" w:pos="1832"/>
+          <w:tab w:val="left" w:pos="2748"/>
+          <w:tab w:val="left" w:pos="3664"/>
+          <w:tab w:val="left" w:pos="4580"/>
+          <w:tab w:val="left" w:pos="5496"/>
+          <w:tab w:val="left" w:pos="6412"/>
+          <w:tab w:val="left" w:pos="7328"/>
+          <w:tab w:val="left" w:pos="8244"/>
+          <w:tab w:val="left" w:pos="9160"/>
+          <w:tab w:val="left" w:pos="10076"/>
+          <w:tab w:val="left" w:pos="10992"/>
+          <w:tab w:val="left" w:pos="11908"/>
+          <w:tab w:val="left" w:pos="12824"/>
+          <w:tab w:val="left" w:pos="13740"/>
+          <w:tab w:val="left" w:pos="14656"/>
+        </w:tabs>
+        <w:spacing w:after="0" w:line="240" w:lineRule="auto"/>
+        <w:rPr>
+          <w:rFonts w:ascii="Courier New" w:eastAsia="Times New Roman" w:hAnsi="Courier New" w:cs="Courier New"/>
+          <w:sz w:val="20"/>
+          <w:szCs w:val="20"/>
+          <w:lang w:eastAsia="de-DE"/>
+        </w:rPr>
+      </w:pPr>
+      <w:r>
+        <w:rPr>
+          <w:rFonts w:ascii="Courier New" w:eastAsia="Times New Roman" w:hAnsi="Courier New" w:cs="Courier New"/>
+          <w:sz w:val="20"/>
+          <w:szCs w:val="20"/>
+          <w:lang w:eastAsia="de-DE"/>
+        </w:rPr>
+        <w:t>Bitcoin (BTC)</w:t>
+      </w:r>
+      <w:r>
+        <w:rPr>
+          <w:rFonts w:ascii="Courier New" w:eastAsia="Times New Roman" w:hAnsi="Courier New" w:cs="Courier New"/>
+          <w:sz w:val="20"/>
+          <w:szCs w:val="20"/>
+          <w:lang w:eastAsia="de-DE"/>
+        </w:rPr>
+        <w:br/>
+        <w:t>Ethereum (ETH)</w:t>
+      </w:r>
+      <w:r>
+        <w:rPr>
+          <w:rFonts w:ascii="Courier New" w:eastAsia="Times New Roman" w:hAnsi="Courier New" w:cs="Courier New"/>
+          <w:sz w:val="20"/>
+          <w:szCs w:val="20"/>
+          <w:lang w:eastAsia="de-DE"/>
+        </w:rPr>
+        <w:br/>
+        <w:t>Apple (AAPL)</w:t>
+      </w:r>
+    </w:p>
+    <w:p>
+      <w:pPr>
+        <w:spacing w:after="0" w:line="240" w:lineRule="auto"/>
+        <w:rPr>
+          <w:rFonts w:ascii="Times New Roman" w:eastAsia="Times New Roman" w:hAnsi="Times New Roman" w:cs="Times New Roman"/>
+          <w:sz w:val="24"/>
+          <w:szCs w:val="24"/>
+          <w:lang w:eastAsia="de-DE"/>
+        </w:rPr>
+      </w:pPr>
+      <w:r>
+        <w:rPr>
+          <w:rFonts w:ascii="Times New Roman" w:eastAsia="Times New Roman" w:hAnsi="Times New Roman" w:cs="Times New Roman"/>
+          <w:sz w:val="24"/>
+          <w:szCs w:val="24"/>
+          <w:lang w:eastAsia="de-DE"/>
+        </w:rPr>
+        <w:pict>
+          <v:rect id="_x0000_i1025" style="width:0;height:1.5pt" o:hralign="center" o:hrstd="t" o:hr="t" fillcolor="#a0a0a0" stroked="f"/>
+        </w:pict>
+      </w:r>
+    </w:p>
+    <w:p>
+      <w:pPr>
+        <w:spacing w:before="100" w:beforeAutospacing="1" w:after="100" w:afterAutospacing="1" w:line="240" w:lineRule="auto"/>
+        <w:outlineLvl w:val="1"/>
+        <w:rPr>
+          <w:rFonts w:ascii="Times New Roman" w:eastAsia="Times New Roman" w:hAnsi="Times New Roman" w:cs="Times New Roman"/>
+          <w:b/>
+          <w:bCs/>
+          <w:sz w:val="36"/>
+          <w:szCs w:val="36"/>
+          <w:lang w:eastAsia="de-DE"/>
+        </w:rPr>
+      </w:pPr>
+      <w:r>
+        <w:rPr>
+          <w:rFonts w:ascii="Segoe UI Emoji" w:eastAsia="Times New Roman" w:hAnsi="Segoe UI Emoji" w:cs="Segoe UI Emoji"/>
+          <w:b/>
+          <w:bCs/>
+          <w:sz w:val="36"/>
+          <w:szCs w:val="36"/>
+          <w:lang w:eastAsia="de-DE"/>
+        </w:rPr>
+        <w:t>🔹</w:t>
+      </w:r>
+      <w:r>
+        <w:rPr>
+          <w:rFonts w:ascii="Times New Roman" w:eastAsia="Times New Roman" w:hAnsi="Times New Roman" w:cs="Times New Roman"/>
+          <w:b/>
+          <w:bCs/>
+          <w:sz w:val="36"/>
+          <w:szCs w:val="36"/>
+          <w:lang w:eastAsia="de-DE"/>
+        </w:rPr>
+        <w:t xml:space="preserve"> </w:t>
+      </w:r>
+      <w:proofErr w:type="spellStart"/>
+      <w:r>
+        <w:rPr>
+          <w:rFonts w:ascii="Times New Roman" w:eastAsia="Times New Roman" w:hAnsi="Times New Roman" w:cs="Times New Roman"/>
+          <w:b/>
+          <w:bCs/>
+          <w:sz w:val="36"/>
+          <w:szCs w:val="36"/>
+          <w:lang w:eastAsia="de-DE"/>
+        </w:rPr>
+        <w:t>asset_types</w:t>
+      </w:r>
+      <w:proofErr w:type="spellEnd"/>
+      <w:r>
+        <w:rPr>
+          <w:rFonts w:ascii="Times New Roman" w:eastAsia="Times New Roman" w:hAnsi="Times New Roman" w:cs="Times New Roman"/>
+          <w:b/>
+          <w:bCs/>
+          <w:sz w:val="36"/>
+          <w:szCs w:val="36"/>
+          <w:lang w:eastAsia="de-DE"/>
+        </w:rPr>
+        <w:t xml:space="preserve"> = </w:t>
+      </w:r>
+      <w:proofErr w:type="spellStart"/>
+      <w:r>
+        <w:rPr>
+          <w:rFonts w:ascii="Times New Roman" w:eastAsia="Times New Roman" w:hAnsi="Times New Roman" w:cs="Times New Roman"/>
+          <w:b/>
+          <w:bCs/>
+          <w:sz w:val="36"/>
+          <w:szCs w:val="36"/>
+          <w:lang w:eastAsia="de-DE"/>
+        </w:rPr>
+        <w:t>категорії</w:t>
+      </w:r>
+      <w:proofErr w:type="spellEnd"/>
+    </w:p>
+    <w:p>
+      <w:pPr>
+        <w:spacing w:before="100" w:beforeAutospacing="1" w:after="100" w:afterAutospacing="1" w:line="240" w:lineRule="auto"/>
+        <w:rPr>
+          <w:rFonts w:ascii="Times New Roman" w:eastAsia="Times New Roman" w:hAnsi="Times New Roman" w:cs="Times New Roman"/>
+          <w:sz w:val="24"/>
+          <w:szCs w:val="24"/>
+          <w:lang w:eastAsia="de-DE"/>
+        </w:rPr>
+      </w:pPr>
+      <w:bookmarkStart w:id="0" w:name="_GoBack"/>
+      <w:r>
+        <w:rPr>
+          <w:rFonts w:ascii="Segoe UI Emoji" w:eastAsia="Times New Roman" w:hAnsi="Segoe UI Emoji" w:cs="Segoe UI Emoji"/>
+          <w:sz w:val="24"/>
+          <w:szCs w:val="24"/>
+          <w:lang w:eastAsia="de-DE"/>
+        </w:rPr>
+        <w:t>👉</w:t>
+      </w:r>
+      <w:r>
+        <w:rPr>
+          <w:rFonts w:ascii="Times New Roman" w:eastAsia="Times New Roman" w:hAnsi="Times New Roman" w:cs="Times New Roman"/>
+          <w:sz w:val="24"/>
+          <w:szCs w:val="24"/>
+          <w:lang w:eastAsia="de-DE"/>
+        </w:rPr>
+        <w:t xml:space="preserve"> </w:t>
+      </w:r>
+      <w:proofErr w:type="spellStart"/>
+      <w:r>
+        <w:rPr>
+          <w:rFonts w:ascii="Times New Roman" w:eastAsia="Times New Roman" w:hAnsi="Times New Roman" w:cs="Times New Roman"/>
+          <w:sz w:val="24"/>
+          <w:szCs w:val="24"/>
+          <w:lang w:eastAsia="de-DE"/>
+        </w:rPr>
+        <w:t>до</w:t>
+      </w:r>
+      <w:proofErr w:type="spellEnd"/>
+      <w:r>
+        <w:rPr>
+          <w:rFonts w:ascii="Times New Roman" w:eastAsia="Times New Roman" w:hAnsi="Times New Roman" w:cs="Times New Roman"/>
+          <w:sz w:val="24"/>
+          <w:szCs w:val="24"/>
+          <w:lang w:eastAsia="de-DE"/>
+        </w:rPr>
+        <w:t xml:space="preserve"> </w:t>
+      </w:r>
+      <w:proofErr w:type="spellStart"/>
+      <w:r>
+        <w:rPr>
+          <w:rFonts w:ascii="Times New Roman" w:eastAsia="Times New Roman" w:hAnsi="Times New Roman" w:cs="Times New Roman"/>
+          <w:sz w:val="24"/>
+          <w:szCs w:val="24"/>
+          <w:lang w:eastAsia="de-DE"/>
+        </w:rPr>
+        <w:t>якого</w:t>
+      </w:r>
+      <w:proofErr w:type="spellEnd"/>
+      <w:r>
+        <w:rPr>
+          <w:rFonts w:ascii="Times New Roman" w:eastAsia="Times New Roman" w:hAnsi="Times New Roman" w:cs="Times New Roman"/>
+          <w:sz w:val="24"/>
+          <w:szCs w:val="24"/>
+          <w:lang w:eastAsia="de-DE"/>
+        </w:rPr>
+        <w:t xml:space="preserve"> </w:t>
+      </w:r>
+      <w:proofErr w:type="spellStart"/>
+      <w:r>
+        <w:rPr>
+          <w:rFonts w:ascii="Times New Roman" w:eastAsia="Times New Roman" w:hAnsi="Times New Roman" w:cs="Times New Roman"/>
+          <w:sz w:val="24"/>
+          <w:szCs w:val="24"/>
+          <w:lang w:eastAsia="de-DE"/>
+        </w:rPr>
+        <w:t>типу</w:t>
+      </w:r>
+      <w:proofErr w:type="spellEnd"/>
+      <w:r>
+        <w:rPr>
+          <w:rFonts w:ascii="Times New Roman" w:eastAsia="Times New Roman" w:hAnsi="Times New Roman" w:cs="Times New Roman"/>
+          <w:sz w:val="24"/>
+          <w:szCs w:val="24"/>
+          <w:lang w:eastAsia="de-DE"/>
+        </w:rPr>
+        <w:t xml:space="preserve"> </w:t>
+      </w:r>
+      <w:proofErr w:type="spellStart"/>
+      <w:r>
+        <w:rPr>
+          <w:rFonts w:ascii="Times New Roman" w:eastAsia="Times New Roman" w:hAnsi="Times New Roman" w:cs="Times New Roman"/>
+          <w:sz w:val="24"/>
+          <w:szCs w:val="24"/>
+          <w:lang w:eastAsia="de-DE"/>
+        </w:rPr>
+        <w:t>це</w:t>
+      </w:r>
+      <w:proofErr w:type="spellEnd"/>
+      <w:r>
+        <w:rPr>
+          <w:rFonts w:ascii="Times New Roman" w:eastAsia="Times New Roman" w:hAnsi="Times New Roman" w:cs="Times New Roman"/>
+          <w:sz w:val="24"/>
+          <w:szCs w:val="24"/>
+          <w:lang w:eastAsia="de-DE"/>
+        </w:rPr>
+        <w:t xml:space="preserve"> </w:t>
+      </w:r>
+      <w:proofErr w:type="spellStart"/>
+      <w:r>
+        <w:rPr>
+          <w:rFonts w:ascii="Times New Roman" w:eastAsia="Times New Roman" w:hAnsi="Times New Roman" w:cs="Times New Roman"/>
+          <w:sz w:val="24"/>
+          <w:szCs w:val="24"/>
+          <w:lang w:eastAsia="de-DE"/>
+        </w:rPr>
+        <w:t>відноситься</w:t>
+      </w:r>
+      <w:proofErr w:type="spellEnd"/>
+    </w:p>
     <w:bookmarkEnd w:id="0"/>
+    <w:p>
+      <w:pPr>
+        <w:tabs>
+          <w:tab w:val="left" w:pos="916"/>
+          <w:tab w:val="left" w:pos="1832"/>
+          <w:tab w:val="left" w:pos="2748"/>
+          <w:tab w:val="left" w:pos="3664"/>
+          <w:tab w:val="left" w:pos="4580"/>
+          <w:tab w:val="left" w:pos="5496"/>
+          <w:tab w:val="left" w:pos="6412"/>
+          <w:tab w:val="left" w:pos="7328"/>
+          <w:tab w:val="left" w:pos="8244"/>
+          <w:tab w:val="left" w:pos="9160"/>
+          <w:tab w:val="left" w:pos="10076"/>
+          <w:tab w:val="left" w:pos="10992"/>
+          <w:tab w:val="left" w:pos="11908"/>
+          <w:tab w:val="left" w:pos="12824"/>
+          <w:tab w:val="left" w:pos="13740"/>
+          <w:tab w:val="left" w:pos="14656"/>
+        </w:tabs>
+        <w:spacing w:after="0" w:line="240" w:lineRule="auto"/>
+        <w:rPr>
+          <w:rFonts w:ascii="Courier New" w:eastAsia="Times New Roman" w:hAnsi="Courier New" w:cs="Courier New"/>
+          <w:sz w:val="20"/>
+          <w:szCs w:val="20"/>
+          <w:lang w:eastAsia="de-DE"/>
+        </w:rPr>
+      </w:pPr>
+      <w:proofErr w:type="spellStart"/>
+      <w:r>
+        <w:rPr>
+          <w:rFonts w:ascii="Courier New" w:eastAsia="Times New Roman" w:hAnsi="Courier New" w:cs="Courier New"/>
+          <w:sz w:val="20"/>
+          <w:szCs w:val="20"/>
+          <w:lang w:eastAsia="de-DE"/>
+        </w:rPr>
+        <w:t>crypto</w:t>
+      </w:r>
+      <w:proofErr w:type="spellEnd"/>
+      <w:r>
+        <w:rPr>
+          <w:rFonts w:ascii="Courier New" w:eastAsia="Times New Roman" w:hAnsi="Courier New" w:cs="Courier New"/>
+          <w:sz w:val="20"/>
+          <w:szCs w:val="20"/>
+          <w:lang w:eastAsia="de-DE"/>
+        </w:rPr>
+        <w:br/>
+        <w:t>stock</w:t>
+      </w:r>
+      <w:r>
+        <w:rPr>
+          <w:rFonts w:ascii="Courier New" w:eastAsia="Times New Roman" w:hAnsi="Courier New" w:cs="Courier New"/>
+          <w:sz w:val="20"/>
+          <w:szCs w:val="20"/>
+          <w:lang w:eastAsia="de-DE"/>
+        </w:rPr>
+        <w:br/>
+      </w:r>
+      <w:proofErr w:type="spellStart"/>
+      <w:r>
+        <w:rPr>
+          <w:rFonts w:ascii="Courier New" w:eastAsia="Times New Roman" w:hAnsi="Courier New" w:cs="Courier New"/>
+          <w:sz w:val="20"/>
+          <w:szCs w:val="20"/>
+          <w:lang w:eastAsia="de-DE"/>
+        </w:rPr>
+        <w:t>forex</w:t>
+      </w:r>
+      <w:proofErr w:type="spellEnd"/>
+    </w:p>
+    <w:p>
+      <w:pPr>
+        <w:spacing w:after="0" w:line="240" w:lineRule="auto"/>
+        <w:rPr>
+          <w:rFonts w:ascii="Times New Roman" w:eastAsia="Times New Roman" w:hAnsi="Times New Roman" w:cs="Times New Roman"/>
+          <w:sz w:val="24"/>
+          <w:szCs w:val="24"/>
+          <w:lang w:eastAsia="de-DE"/>
+        </w:rPr>
+      </w:pPr>
+      <w:r>
+        <w:rPr>
+          <w:rFonts w:ascii="Times New Roman" w:eastAsia="Times New Roman" w:hAnsi="Times New Roman" w:cs="Times New Roman"/>
+          <w:sz w:val="24"/>
+          <w:szCs w:val="24"/>
+          <w:lang w:eastAsia="de-DE"/>
+        </w:rPr>
+        <w:pict>
+          <v:rect id="_x0000_i1026" style="width:0;height:1.5pt" o:hralign="center" o:hrstd="t" o:hr="t" fillcolor="#a0a0a0" stroked="f"/>
+        </w:pict>
+      </w:r>
+    </w:p>
+    <w:p>
+      <w:pPr>
+        <w:spacing w:before="100" w:beforeAutospacing="1" w:after="100" w:afterAutospacing="1" w:line="240" w:lineRule="auto"/>
+        <w:outlineLvl w:val="0"/>
+        <w:rPr>
+          <w:rFonts w:ascii="Times New Roman" w:eastAsia="Times New Roman" w:hAnsi="Times New Roman" w:cs="Times New Roman"/>
+          <w:b/>
+          <w:bCs/>
+          <w:kern w:val="36"/>
+          <w:sz w:val="48"/>
+          <w:szCs w:val="48"/>
+          <w:lang w:eastAsia="de-DE"/>
+        </w:rPr>
+      </w:pPr>
+      <w:r>
+        <w:rPr>
+          <w:rFonts w:ascii="Segoe UI Emoji" w:eastAsia="Times New Roman" w:hAnsi="Segoe UI Emoji" w:cs="Segoe UI Emoji"/>
+          <w:b/>
+          <w:bCs/>
+          <w:kern w:val="36"/>
+          <w:sz w:val="48"/>
+          <w:szCs w:val="48"/>
+          <w:lang w:eastAsia="de-DE"/>
+        </w:rPr>
+        <w:t>🧠</w:t>
+      </w:r>
+      <w:r>
+        <w:rPr>
+          <w:rFonts w:ascii="Times New Roman" w:eastAsia="Times New Roman" w:hAnsi="Times New Roman" w:cs="Times New Roman"/>
+          <w:b/>
+          <w:bCs/>
+          <w:kern w:val="36"/>
+          <w:sz w:val="48"/>
+          <w:szCs w:val="48"/>
+          <w:lang w:eastAsia="de-DE"/>
+        </w:rPr>
+        <w:t xml:space="preserve"> </w:t>
+      </w:r>
+      <w:proofErr w:type="spellStart"/>
+      <w:r>
+        <w:rPr>
+          <w:rFonts w:ascii="Times New Roman" w:eastAsia="Times New Roman" w:hAnsi="Times New Roman" w:cs="Times New Roman"/>
+          <w:b/>
+          <w:bCs/>
+          <w:kern w:val="36"/>
+          <w:sz w:val="48"/>
+          <w:szCs w:val="48"/>
+          <w:lang w:eastAsia="de-DE"/>
+        </w:rPr>
+        <w:t>Приклад</w:t>
+      </w:r>
+      <w:proofErr w:type="spellEnd"/>
+    </w:p>
+    <w:tbl>
+      <w:tblPr>
+        <w:tblW w:w="5578" w:type="dxa"/>
+        <w:tblCellSpacing w:w="15" w:type="dxa"/>
+        <w:tblBorders>
+          <w:top w:val="single" w:sz="4" w:space="0" w:color="auto"/>
+          <w:left w:val="single" w:sz="4" w:space="0" w:color="auto"/>
+          <w:bottom w:val="single" w:sz="4" w:space="0" w:color="auto"/>
+          <w:right w:val="single" w:sz="4" w:space="0" w:color="auto"/>
+          <w:insideH w:val="single" w:sz="4" w:space="0" w:color="auto"/>
+          <w:insideV w:val="single" w:sz="4" w:space="0" w:color="auto"/>
+        </w:tblBorders>
+        <w:tblCellMar>
+          <w:top w:w="15" w:type="dxa"/>
+          <w:left w:w="15" w:type="dxa"/>
+          <w:bottom w:w="15" w:type="dxa"/>
+          <w:right w:w="15" w:type="dxa"/>
+        </w:tblCellMar>
+        <w:tblLook w:val="04A0" w:firstRow="1" w:lastRow="0" w:firstColumn="1" w:lastColumn="0" w:noHBand="0" w:noVBand="1"/>
+      </w:tblPr>
+      <w:tblGrid>
+        <w:gridCol w:w="1838"/>
+        <w:gridCol w:w="2077"/>
+        <w:gridCol w:w="1663"/>
+      </w:tblGrid>
+      <w:tr>
+        <w:trPr>
+          <w:trHeight w:val="264"/>
+          <w:tblHeader/>
+          <w:tblCellSpacing w:w="15" w:type="dxa"/>
+        </w:trPr>
+        <w:tc>
+          <w:tcPr>
+            <w:tcW w:w="0" w:type="auto"/>
+            <w:vAlign w:val="center"/>
+            <w:hideMark/>
+          </w:tcPr>
+          <w:p>
+            <w:pPr>
+              <w:spacing w:after="0" w:line="240" w:lineRule="auto"/>
+              <w:jc w:val="center"/>
+              <w:rPr>
+                <w:rFonts w:ascii="Times New Roman" w:eastAsia="Times New Roman" w:hAnsi="Times New Roman" w:cs="Times New Roman"/>
+                <w:b/>
+                <w:bCs/>
+                <w:sz w:val="24"/>
+                <w:szCs w:val="24"/>
+                <w:lang w:eastAsia="de-DE"/>
+              </w:rPr>
+            </w:pPr>
+            <w:proofErr w:type="spellStart"/>
+            <w:r>
+              <w:rPr>
+                <w:rFonts w:ascii="Times New Roman" w:eastAsia="Times New Roman" w:hAnsi="Times New Roman" w:cs="Times New Roman"/>
+                <w:b/>
+                <w:bCs/>
+                <w:sz w:val="24"/>
+                <w:szCs w:val="24"/>
+                <w:lang w:eastAsia="de-DE"/>
+              </w:rPr>
+              <w:t>asset_name</w:t>
+            </w:r>
+            <w:proofErr w:type="spellEnd"/>
+          </w:p>
+        </w:tc>
+        <w:tc>
+          <w:tcPr>
+            <w:tcW w:w="0" w:type="auto"/>
+            <w:vAlign w:val="center"/>
+            <w:hideMark/>
+          </w:tcPr>
+          <w:p>
+            <w:pPr>
+              <w:spacing w:after="0" w:line="240" w:lineRule="auto"/>
+              <w:jc w:val="center"/>
+              <w:rPr>
+                <w:rFonts w:ascii="Times New Roman" w:eastAsia="Times New Roman" w:hAnsi="Times New Roman" w:cs="Times New Roman"/>
+                <w:b/>
+                <w:bCs/>
+                <w:sz w:val="24"/>
+                <w:szCs w:val="24"/>
+                <w:lang w:eastAsia="de-DE"/>
+              </w:rPr>
+            </w:pPr>
+            <w:proofErr w:type="spellStart"/>
+            <w:r>
+              <w:rPr>
+                <w:rFonts w:ascii="Times New Roman" w:eastAsia="Times New Roman" w:hAnsi="Times New Roman" w:cs="Times New Roman"/>
+                <w:b/>
+                <w:bCs/>
+                <w:sz w:val="24"/>
+                <w:szCs w:val="24"/>
+                <w:lang w:eastAsia="de-DE"/>
+              </w:rPr>
+              <w:t>asset_symbol</w:t>
+            </w:r>
+            <w:proofErr w:type="spellEnd"/>
+          </w:p>
+        </w:tc>
+        <w:tc>
+          <w:tcPr>
+            <w:tcW w:w="0" w:type="auto"/>
+            <w:vAlign w:val="center"/>
+            <w:hideMark/>
+          </w:tcPr>
+          <w:p>
+            <w:pPr>
+              <w:spacing w:after="0" w:line="240" w:lineRule="auto"/>
+              <w:jc w:val="center"/>
+              <w:rPr>
+                <w:rFonts w:ascii="Times New Roman" w:eastAsia="Times New Roman" w:hAnsi="Times New Roman" w:cs="Times New Roman"/>
+                <w:b/>
+                <w:bCs/>
+                <w:sz w:val="24"/>
+                <w:szCs w:val="24"/>
+                <w:lang w:eastAsia="de-DE"/>
+              </w:rPr>
+            </w:pPr>
+            <w:proofErr w:type="spellStart"/>
+            <w:r>
+              <w:rPr>
+                <w:rFonts w:ascii="Times New Roman" w:eastAsia="Times New Roman" w:hAnsi="Times New Roman" w:cs="Times New Roman"/>
+                <w:b/>
+                <w:bCs/>
+                <w:sz w:val="24"/>
+                <w:szCs w:val="24"/>
+                <w:lang w:eastAsia="de-DE"/>
+              </w:rPr>
+              <w:t>asset_type</w:t>
+            </w:r>
+            <w:proofErr w:type="spellEnd"/>
+          </w:p>
+        </w:tc>
+      </w:tr>
+      <w:tr>
+        <w:trPr>
+          <w:trHeight w:val="275"/>
+          <w:tblCellSpacing w:w="15" w:type="dxa"/>
+        </w:trPr>
+        <w:tc>
+          <w:tcPr>
+            <w:tcW w:w="0" w:type="auto"/>
+            <w:vAlign w:val="center"/>
+            <w:hideMark/>
+          </w:tcPr>
+          <w:p>
+            <w:pPr>
+              <w:spacing w:after="0" w:line="240" w:lineRule="auto"/>
+              <w:rPr>
+                <w:rFonts w:ascii="Times New Roman" w:eastAsia="Times New Roman" w:hAnsi="Times New Roman" w:cs="Times New Roman"/>
+                <w:sz w:val="24"/>
+                <w:szCs w:val="24"/>
+                <w:lang w:eastAsia="de-DE"/>
+              </w:rPr>
+            </w:pPr>
+            <w:r>
+              <w:rPr>
+                <w:rFonts w:ascii="Times New Roman" w:eastAsia="Times New Roman" w:hAnsi="Times New Roman" w:cs="Times New Roman"/>
+                <w:sz w:val="24"/>
+                <w:szCs w:val="24"/>
+                <w:lang w:eastAsia="de-DE"/>
+              </w:rPr>
+              <w:t>Bitcoin</w:t>
+            </w:r>
+          </w:p>
+        </w:tc>
+        <w:tc>
+          <w:tcPr>
+            <w:tcW w:w="0" w:type="auto"/>
+            <w:vAlign w:val="center"/>
+            <w:hideMark/>
+          </w:tcPr>
+          <w:p>
+            <w:pPr>
+              <w:spacing w:after="0" w:line="240" w:lineRule="auto"/>
+              <w:rPr>
+                <w:rFonts w:ascii="Times New Roman" w:eastAsia="Times New Roman" w:hAnsi="Times New Roman" w:cs="Times New Roman"/>
+                <w:sz w:val="24"/>
+                <w:szCs w:val="24"/>
+                <w:lang w:eastAsia="de-DE"/>
+              </w:rPr>
+            </w:pPr>
+            <w:r>
+              <w:rPr>
+                <w:rFonts w:ascii="Times New Roman" w:eastAsia="Times New Roman" w:hAnsi="Times New Roman" w:cs="Times New Roman"/>
+                <w:sz w:val="24"/>
+                <w:szCs w:val="24"/>
+                <w:lang w:eastAsia="de-DE"/>
+              </w:rPr>
+              <w:t>BTC</w:t>
+            </w:r>
+          </w:p>
+        </w:tc>
+        <w:tc>
+          <w:tcPr>
+            <w:tcW w:w="0" w:type="auto"/>
+            <w:vAlign w:val="center"/>
+            <w:hideMark/>
+          </w:tcPr>
+          <w:p>
+            <w:pPr>
+              <w:spacing w:after="0" w:line="240" w:lineRule="auto"/>
+              <w:rPr>
+                <w:rFonts w:ascii="Times New Roman" w:eastAsia="Times New Roman" w:hAnsi="Times New Roman" w:cs="Times New Roman"/>
+                <w:sz w:val="24"/>
+                <w:szCs w:val="24"/>
+                <w:lang w:eastAsia="de-DE"/>
+              </w:rPr>
+            </w:pPr>
+            <w:proofErr w:type="spellStart"/>
+            <w:r>
+              <w:rPr>
+                <w:rFonts w:ascii="Times New Roman" w:eastAsia="Times New Roman" w:hAnsi="Times New Roman" w:cs="Times New Roman"/>
+                <w:sz w:val="24"/>
+                <w:szCs w:val="24"/>
+                <w:lang w:eastAsia="de-DE"/>
+              </w:rPr>
+              <w:t>crypto</w:t>
+            </w:r>
+            <w:proofErr w:type="spellEnd"/>
+          </w:p>
+        </w:tc>
+      </w:tr>
+      <w:tr>
+        <w:trPr>
+          <w:trHeight w:val="264"/>
+          <w:tblCellSpacing w:w="15" w:type="dxa"/>
+        </w:trPr>
+        <w:tc>
+          <w:tcPr>
+            <w:tcW w:w="0" w:type="auto"/>
+            <w:vAlign w:val="center"/>
+            <w:hideMark/>
+          </w:tcPr>
+          <w:p>
+            <w:pPr>
+              <w:spacing w:after="0" w:line="240" w:lineRule="auto"/>
+              <w:rPr>
+                <w:rFonts w:ascii="Times New Roman" w:eastAsia="Times New Roman" w:hAnsi="Times New Roman" w:cs="Times New Roman"/>
+                <w:sz w:val="24"/>
+                <w:szCs w:val="24"/>
+                <w:lang w:eastAsia="de-DE"/>
+              </w:rPr>
+            </w:pPr>
+            <w:r>
+              <w:rPr>
+                <w:rFonts w:ascii="Times New Roman" w:eastAsia="Times New Roman" w:hAnsi="Times New Roman" w:cs="Times New Roman"/>
+                <w:sz w:val="24"/>
+                <w:szCs w:val="24"/>
+                <w:lang w:eastAsia="de-DE"/>
+              </w:rPr>
+              <w:t>Ethereum</w:t>
+            </w:r>
+          </w:p>
+        </w:tc>
+        <w:tc>
+          <w:tcPr>
+            <w:tcW w:w="0" w:type="auto"/>
+            <w:vAlign w:val="center"/>
+            <w:hideMark/>
+          </w:tcPr>
+          <w:p>
+            <w:pPr>
+              <w:spacing w:after="0" w:line="240" w:lineRule="auto"/>
+              <w:rPr>
+                <w:rFonts w:ascii="Times New Roman" w:eastAsia="Times New Roman" w:hAnsi="Times New Roman" w:cs="Times New Roman"/>
+                <w:sz w:val="24"/>
+                <w:szCs w:val="24"/>
+                <w:lang w:eastAsia="de-DE"/>
+              </w:rPr>
+            </w:pPr>
+            <w:r>
+              <w:rPr>
+                <w:rFonts w:ascii="Times New Roman" w:eastAsia="Times New Roman" w:hAnsi="Times New Roman" w:cs="Times New Roman"/>
+                <w:sz w:val="24"/>
+                <w:szCs w:val="24"/>
+                <w:lang w:eastAsia="de-DE"/>
+              </w:rPr>
+              <w:t>ETH</w:t>
+            </w:r>
+          </w:p>
+        </w:tc>
+        <w:tc>
+          <w:tcPr>
+            <w:tcW w:w="0" w:type="auto"/>
+            <w:vAlign w:val="center"/>
+            <w:hideMark/>
+          </w:tcPr>
+          <w:p>
+            <w:pPr>
+              <w:spacing w:after="0" w:line="240" w:lineRule="auto"/>
+              <w:rPr>
+                <w:rFonts w:ascii="Times New Roman" w:eastAsia="Times New Roman" w:hAnsi="Times New Roman" w:cs="Times New Roman"/>
+                <w:sz w:val="24"/>
+                <w:szCs w:val="24"/>
+                <w:lang w:eastAsia="de-DE"/>
+              </w:rPr>
+            </w:pPr>
+            <w:proofErr w:type="spellStart"/>
+            <w:r>
+              <w:rPr>
+                <w:rFonts w:ascii="Times New Roman" w:eastAsia="Times New Roman" w:hAnsi="Times New Roman" w:cs="Times New Roman"/>
+                <w:sz w:val="24"/>
+                <w:szCs w:val="24"/>
+                <w:lang w:eastAsia="de-DE"/>
+              </w:rPr>
+              <w:t>crypto</w:t>
+            </w:r>
+            <w:proofErr w:type="spellEnd"/>
+          </w:p>
+        </w:tc>
+      </w:tr>
+      <w:tr>
+        <w:trPr>
+          <w:trHeight w:val="275"/>
+          <w:tblCellSpacing w:w="15" w:type="dxa"/>
+        </w:trPr>
+        <w:tc>
+          <w:tcPr>
+            <w:tcW w:w="0" w:type="auto"/>
+            <w:vAlign w:val="center"/>
+            <w:hideMark/>
+          </w:tcPr>
+          <w:p>
+            <w:pPr>
+              <w:spacing w:after="0" w:line="240" w:lineRule="auto"/>
+              <w:rPr>
+                <w:rFonts w:ascii="Times New Roman" w:eastAsia="Times New Roman" w:hAnsi="Times New Roman" w:cs="Times New Roman"/>
+                <w:sz w:val="24"/>
+                <w:szCs w:val="24"/>
+                <w:lang w:eastAsia="de-DE"/>
+              </w:rPr>
+            </w:pPr>
+            <w:r>
+              <w:rPr>
+                <w:rFonts w:ascii="Times New Roman" w:eastAsia="Times New Roman" w:hAnsi="Times New Roman" w:cs="Times New Roman"/>
+                <w:sz w:val="24"/>
+                <w:szCs w:val="24"/>
+                <w:lang w:eastAsia="de-DE"/>
+              </w:rPr>
+              <w:t>Apple</w:t>
+            </w:r>
+          </w:p>
+        </w:tc>
+        <w:tc>
+          <w:tcPr>
+            <w:tcW w:w="0" w:type="auto"/>
+            <w:vAlign w:val="center"/>
+            <w:hideMark/>
+          </w:tcPr>
+          <w:p>
+            <w:pPr>
+              <w:spacing w:after="0" w:line="240" w:lineRule="auto"/>
+              <w:rPr>
+                <w:rFonts w:ascii="Times New Roman" w:eastAsia="Times New Roman" w:hAnsi="Times New Roman" w:cs="Times New Roman"/>
+                <w:sz w:val="24"/>
+                <w:szCs w:val="24"/>
+                <w:lang w:eastAsia="de-DE"/>
+              </w:rPr>
+            </w:pPr>
+            <w:r>
+              <w:rPr>
+                <w:rFonts w:ascii="Times New Roman" w:eastAsia="Times New Roman" w:hAnsi="Times New Roman" w:cs="Times New Roman"/>
+                <w:sz w:val="24"/>
+                <w:szCs w:val="24"/>
+                <w:lang w:eastAsia="de-DE"/>
+              </w:rPr>
+              <w:t>AAPL</w:t>
+            </w:r>
+          </w:p>
+        </w:tc>
+        <w:tc>
+          <w:tcPr>
+            <w:tcW w:w="0" w:type="auto"/>
+            <w:vAlign w:val="center"/>
+            <w:hideMark/>
+          </w:tcPr>
+          <w:p>
+            <w:pPr>
+              <w:spacing w:after="0" w:line="240" w:lineRule="auto"/>
+              <w:rPr>
+                <w:rFonts w:ascii="Times New Roman" w:eastAsia="Times New Roman" w:hAnsi="Times New Roman" w:cs="Times New Roman"/>
+                <w:sz w:val="24"/>
+                <w:szCs w:val="24"/>
+                <w:lang w:eastAsia="de-DE"/>
+              </w:rPr>
+            </w:pPr>
+            <w:r>
+              <w:rPr>
+                <w:rFonts w:ascii="Times New Roman" w:eastAsia="Times New Roman" w:hAnsi="Times New Roman" w:cs="Times New Roman"/>
+                <w:sz w:val="24"/>
+                <w:szCs w:val="24"/>
+                <w:lang w:eastAsia="de-DE"/>
+              </w:rPr>
+              <w:t>stock</w:t>
+            </w:r>
+          </w:p>
+        </w:tc>
+      </w:tr>
+    </w:tbl>
     <w:p>
       <w:pPr>
         <w:rPr>
@@ -1059,6 +2460,47 @@
     <w:name w:val="Normal"/>
     <w:qFormat/>
   </w:style>
+  <w:style w:type="paragraph" w:styleId="berschrift1">
+    <w:name w:val="heading 1"/>
+    <w:basedOn w:val="Standard"/>
+    <w:link w:val="berschrift1Zchn"/>
+    <w:uiPriority w:val="9"/>
+    <w:qFormat/>
+    <w:rsid w:val="001D2DFB"/>
+    <w:pPr>
+      <w:spacing w:before="100" w:beforeAutospacing="1" w:after="100" w:afterAutospacing="1" w:line="240" w:lineRule="auto"/>
+      <w:outlineLvl w:val="0"/>
+    </w:pPr>
+    <w:rPr>
+      <w:rFonts w:ascii="Times New Roman" w:eastAsia="Times New Roman" w:hAnsi="Times New Roman" w:cs="Times New Roman"/>
+      <w:b/>
+      <w:bCs/>
+      <w:kern w:val="36"/>
+      <w:sz w:val="48"/>
+      <w:szCs w:val="48"/>
+      <w:lang w:eastAsia="de-DE"/>
+    </w:rPr>
+  </w:style>
+  <w:style w:type="paragraph" w:styleId="berschrift2">
+    <w:name w:val="heading 2"/>
+    <w:basedOn w:val="Standard"/>
+    <w:link w:val="berschrift2Zchn"/>
+    <w:uiPriority w:val="9"/>
+    <w:qFormat/>
+    <w:rsid w:val="001D2DFB"/>
+    <w:pPr>
+      <w:spacing w:before="100" w:beforeAutospacing="1" w:after="100" w:afterAutospacing="1" w:line="240" w:lineRule="auto"/>
+      <w:outlineLvl w:val="1"/>
+    </w:pPr>
+    <w:rPr>
+      <w:rFonts w:ascii="Times New Roman" w:eastAsia="Times New Roman" w:hAnsi="Times New Roman" w:cs="Times New Roman"/>
+      <w:b/>
+      <w:bCs/>
+      <w:sz w:val="36"/>
+      <w:szCs w:val="36"/>
+      <w:lang w:eastAsia="de-DE"/>
+    </w:rPr>
+  </w:style>
   <w:style w:type="character" w:default="1" w:styleId="Absatz-Standardschriftart">
     <w:name w:val="Default Paragraph Font"/>
     <w:uiPriority w:val="1"/>
@@ -1114,6 +2556,98 @@
       <w:rFonts w:ascii="Times New Roman" w:eastAsia="Times New Roman" w:hAnsi="Times New Roman" w:cs="Times New Roman"/>
       <w:sz w:val="24"/>
       <w:szCs w:val="24"/>
+      <w:lang w:eastAsia="de-DE"/>
+    </w:rPr>
+  </w:style>
+  <w:style w:type="character" w:customStyle="1" w:styleId="berschrift1Zchn">
+    <w:name w:val="Überschrift 1 Zchn"/>
+    <w:basedOn w:val="Absatz-Standardschriftart"/>
+    <w:link w:val="berschrift1"/>
+    <w:uiPriority w:val="9"/>
+    <w:rsid w:val="001D2DFB"/>
+    <w:rPr>
+      <w:rFonts w:ascii="Times New Roman" w:eastAsia="Times New Roman" w:hAnsi="Times New Roman" w:cs="Times New Roman"/>
+      <w:b/>
+      <w:bCs/>
+      <w:kern w:val="36"/>
+      <w:sz w:val="48"/>
+      <w:szCs w:val="48"/>
+      <w:lang w:eastAsia="de-DE"/>
+    </w:rPr>
+  </w:style>
+  <w:style w:type="character" w:customStyle="1" w:styleId="berschrift2Zchn">
+    <w:name w:val="Überschrift 2 Zchn"/>
+    <w:basedOn w:val="Absatz-Standardschriftart"/>
+    <w:link w:val="berschrift2"/>
+    <w:uiPriority w:val="9"/>
+    <w:rsid w:val="001D2DFB"/>
+    <w:rPr>
+      <w:rFonts w:ascii="Times New Roman" w:eastAsia="Times New Roman" w:hAnsi="Times New Roman" w:cs="Times New Roman"/>
+      <w:b/>
+      <w:bCs/>
+      <w:sz w:val="36"/>
+      <w:szCs w:val="36"/>
+      <w:lang w:eastAsia="de-DE"/>
+    </w:rPr>
+  </w:style>
+  <w:style w:type="character" w:styleId="Fett">
+    <w:name w:val="Strong"/>
+    <w:basedOn w:val="Absatz-Standardschriftart"/>
+    <w:uiPriority w:val="22"/>
+    <w:qFormat/>
+    <w:rsid w:val="001D2DFB"/>
+    <w:rPr>
+      <w:b/>
+      <w:bCs/>
+    </w:rPr>
+  </w:style>
+  <w:style w:type="paragraph" w:styleId="HTMLVorformatiert">
+    <w:name w:val="HTML Preformatted"/>
+    <w:basedOn w:val="Standard"/>
+    <w:link w:val="HTMLVorformatiertZchn"/>
+    <w:uiPriority w:val="99"/>
+    <w:semiHidden/>
+    <w:unhideWhenUsed/>
+    <w:rsid w:val="001D2DFB"/>
+    <w:pPr>
+      <w:tabs>
+        <w:tab w:val="left" w:pos="916"/>
+        <w:tab w:val="left" w:pos="1832"/>
+        <w:tab w:val="left" w:pos="2748"/>
+        <w:tab w:val="left" w:pos="3664"/>
+        <w:tab w:val="left" w:pos="4580"/>
+        <w:tab w:val="left" w:pos="5496"/>
+        <w:tab w:val="left" w:pos="6412"/>
+        <w:tab w:val="left" w:pos="7328"/>
+        <w:tab w:val="left" w:pos="8244"/>
+        <w:tab w:val="left" w:pos="9160"/>
+        <w:tab w:val="left" w:pos="10076"/>
+        <w:tab w:val="left" w:pos="10992"/>
+        <w:tab w:val="left" w:pos="11908"/>
+        <w:tab w:val="left" w:pos="12824"/>
+        <w:tab w:val="left" w:pos="13740"/>
+        <w:tab w:val="left" w:pos="14656"/>
+      </w:tabs>
+      <w:spacing w:after="0" w:line="240" w:lineRule="auto"/>
+    </w:pPr>
+    <w:rPr>
+      <w:rFonts w:ascii="Courier New" w:eastAsia="Times New Roman" w:hAnsi="Courier New" w:cs="Courier New"/>
+      <w:sz w:val="20"/>
+      <w:szCs w:val="20"/>
+      <w:lang w:eastAsia="de-DE"/>
+    </w:rPr>
+  </w:style>
+  <w:style w:type="character" w:customStyle="1" w:styleId="HTMLVorformatiertZchn">
+    <w:name w:val="HTML Vorformatiert Zchn"/>
+    <w:basedOn w:val="Absatz-Standardschriftart"/>
+    <w:link w:val="HTMLVorformatiert"/>
+    <w:uiPriority w:val="99"/>
+    <w:semiHidden/>
+    <w:rsid w:val="001D2DFB"/>
+    <w:rPr>
+      <w:rFonts w:ascii="Courier New" w:eastAsia="Times New Roman" w:hAnsi="Courier New" w:cs="Courier New"/>
+      <w:sz w:val="20"/>
+      <w:szCs w:val="20"/>
       <w:lang w:eastAsia="de-DE"/>
     </w:rPr>
   </w:style>

</xml_diff>